<commit_message>
12-05 18:24, mb, chỉnh sửa kinh phổ môn thêm time stamps
</commit_message>
<xml_diff>
--- a/kinh_pho_mon_dang_dinh_dang.docx
+++ b/kinh_pho_mon_dang_dinh_dang.docx
@@ -10,12 +10,97 @@
           <w:bCs/>
         </w:rPr>
       </w:pPr>
+      <w:bookmarkStart w:id="0" w:name="_Hlk215851261"/>
       <w:r>
         <w:rPr>
           <w:b/>
           <w:bCs/>
         </w:rPr>
         <w:t>KINH PHỔ MÔN</w:t>
+      </w:r>
+      <w:r>
+        <w:rPr>
+          <w:b/>
+          <w:bCs/>
+        </w:rPr>
+        <w:t xml:space="preserve"> </w:t>
+      </w:r>
+    </w:p>
+    <w:p>
+      <w:pPr>
+        <w:pStyle w:val="Heading1"/>
+        <w:tabs>
+          <w:tab w:val="left" w:pos="284"/>
+        </w:tabs>
+      </w:pPr>
+      <w:r>
+        <w:t xml:space="preserve"># </w:t>
+      </w:r>
+      <w:r>
+        <w:t>DÂNG HƯƠN</w:t>
+      </w:r>
+      <w:r>
+        <w:t>G 00:00 (Pháp Hoà)</w:t>
+      </w:r>
+    </w:p>
+    <w:p>
+      <w:r>
+        <w:t xml:space="preserve">Nguyện đem lòng thành kính </w:t>
+      </w:r>
+    </w:p>
+    <w:p>
+      <w:r>
+        <w:t>Gởi theo đám mây hương</w:t>
+      </w:r>
+    </w:p>
+    <w:p>
+      <w:r>
+        <w:t>Phảng phất khắp mười phương</w:t>
+      </w:r>
+    </w:p>
+    <w:p>
+      <w:r>
+        <w:t xml:space="preserve">Cúng dường ngôi Tam bảo </w:t>
+      </w:r>
+    </w:p>
+    <w:p>
+      <w:r>
+        <w:t xml:space="preserve">Thề trọn đời giữ đạo </w:t>
+      </w:r>
+    </w:p>
+    <w:p>
+      <w:r>
+        <w:t xml:space="preserve">Theo tự tánh làm </w:t>
+      </w:r>
+    </w:p>
+    <w:p>
+      <w:r>
+        <w:t>Cùng pháp giới chúng sanh</w:t>
+      </w:r>
+    </w:p>
+    <w:p>
+      <w:r>
+        <w:t xml:space="preserve">Cầu Phật từ gia hộ </w:t>
+      </w:r>
+    </w:p>
+    <w:p>
+      <w:r>
+        <w:t xml:space="preserve">Tâm Bồ đề kiên cố </w:t>
+      </w:r>
+    </w:p>
+    <w:p>
+      <w:r>
+        <w:t xml:space="preserve">Chí tu học vững bền </w:t>
+      </w:r>
+    </w:p>
+    <w:p>
+      <w:r>
+        <w:t xml:space="preserve">Xa bể khổ nguồn mê Chóng quay về bờ giác </w:t>
+      </w:r>
+    </w:p>
+    <w:p>
+      <w:r>
+        <w:t>Nam mô Hương Cúng Dường Bồ Tát ( 3 lần)</w:t>
       </w:r>
     </w:p>
     <w:p>
@@ -31,722 +116,988 @@
         <w:ind w:left="0" w:firstLine="0"/>
       </w:pPr>
       <w:r>
-        <w:t>DÂNG HƯƠNG</w:t>
-      </w:r>
-    </w:p>
-    <w:p>
-      <w:r>
-        <w:t xml:space="preserve">Nguyện đem lòng thành kính </w:t>
-      </w:r>
-    </w:p>
-    <w:p>
-      <w:r>
-        <w:t>Gởi theo đám mây hương</w:t>
-      </w:r>
-    </w:p>
-    <w:p>
-      <w:r>
-        <w:t>Phảng phất khắp mười phương</w:t>
-      </w:r>
-    </w:p>
-    <w:p>
-      <w:r>
-        <w:t xml:space="preserve">Cúng dường ngôi Tam bảo </w:t>
-      </w:r>
-    </w:p>
-    <w:p>
-      <w:r>
-        <w:t xml:space="preserve">Thề trọn đời giữ đạo </w:t>
-      </w:r>
-    </w:p>
-    <w:p>
-      <w:r>
-        <w:t xml:space="preserve">Theo tự tánh làm </w:t>
-      </w:r>
-    </w:p>
-    <w:p>
-      <w:r>
-        <w:t>Cùng pháp giới chúng sanh</w:t>
-      </w:r>
-    </w:p>
-    <w:p>
-      <w:r>
-        <w:t xml:space="preserve">Cầu Phật từ gia hộ </w:t>
-      </w:r>
-    </w:p>
-    <w:p>
-      <w:r>
-        <w:t xml:space="preserve">Tâm Bồ đề kiên cố </w:t>
-      </w:r>
-    </w:p>
-    <w:p>
-      <w:r>
-        <w:t xml:space="preserve">Chí tu học vững bền </w:t>
-      </w:r>
-    </w:p>
-    <w:p>
-      <w:r>
-        <w:t xml:space="preserve">Xa bể khổ nguồn mê Chóng quay về bờ giác </w:t>
-      </w:r>
-    </w:p>
-    <w:p>
-      <w:r>
-        <w:t>Nam mô Hương Cúng Dường Bồ Tát ( 3 lần)</w:t>
-      </w:r>
-    </w:p>
+        <w:t xml:space="preserve">BẠCH PHẬT </w:t>
+      </w:r>
+      <w:r>
+        <w:t>01: 25 (Pháp Hoà)</w:t>
+      </w:r>
+    </w:p>
+    <w:p>
+      <w:r>
+        <w:t xml:space="preserve">Hôm nay </w:t>
+      </w:r>
+      <w:r>
+        <w:t xml:space="preserve"> </w:t>
+      </w:r>
+      <w:r>
+        <w:t xml:space="preserve">đệ tử chúng con </w:t>
+      </w:r>
+      <w:r>
+        <w:t xml:space="preserve">một dạ </w:t>
+      </w:r>
+      <w:r>
+        <w:t>C</w:t>
+      </w:r>
+      <w:r>
+        <w:t xml:space="preserve">hí thành phụng đối trước </w:t>
+      </w:r>
+      <w:r>
+        <w:t>T</w:t>
+      </w:r>
+      <w:r>
+        <w:t xml:space="preserve">am </w:t>
+      </w:r>
+      <w:r>
+        <w:t>B</w:t>
+      </w:r>
+      <w:r>
+        <w:t xml:space="preserve">ảo. </w:t>
+      </w:r>
+    </w:p>
+    <w:p>
+      <w:r>
+        <w:t xml:space="preserve">Chí thành </w:t>
+      </w:r>
+      <w:r>
+        <w:t>T</w:t>
+      </w:r>
+      <w:r>
+        <w:t>rì tụng kinh chí Xưng niệ</w:t>
+      </w:r>
+      <w:r>
+        <w:t>m</w:t>
+      </w:r>
+      <w:r>
+        <w:t xml:space="preserve"> Hồng Danh </w:t>
+      </w:r>
+    </w:p>
+    <w:p>
+      <w:r>
+        <w:t>Nguyện hồi hướng c</w:t>
+      </w:r>
+      <w:r>
+        <w:t>ô</w:t>
+      </w:r>
+      <w:r>
+        <w:t>ng đức</w:t>
+      </w:r>
+      <w:r>
+        <w:t xml:space="preserve"> </w:t>
+      </w:r>
+    </w:p>
+    <w:p>
+      <w:r>
+        <w:t>Kỳ nguyện thế giới hoà bình</w:t>
+      </w:r>
+      <w:r>
+        <w:t xml:space="preserve"> </w:t>
+      </w:r>
+    </w:p>
+    <w:p>
+      <w:r>
+        <w:t>Chúng sinh an lạc</w:t>
+      </w:r>
+      <w:r>
+        <w:t xml:space="preserve">. </w:t>
+      </w:r>
+    </w:p>
+    <w:p>
+      <w:r>
+        <w:t>Cửa thiền thanh tịnh đại chúng an hoà</w:t>
+      </w:r>
+      <w:r>
+        <w:t xml:space="preserve">. </w:t>
+      </w:r>
+    </w:p>
+    <w:p>
+      <w:r>
+        <w:t>Tất cả chúng con nghiệp chướng tiêu trừ thanh tâm an tịnh, bệnh khổ tiêu tan.</w:t>
+      </w:r>
+    </w:p>
+    <w:p>
+      <w:r>
+        <w:t>Quyến thuộc bình an kiết tường như ý</w:t>
+      </w:r>
+      <w:r>
+        <w:t>.</w:t>
+      </w:r>
+    </w:p>
+    <w:p>
+      <w:r>
+        <w:t>Tinh tấn tu học phúc tuệ trang nghiê</w:t>
+      </w:r>
+      <w:r>
+        <w:t>m</w:t>
+      </w:r>
+      <w:r>
+        <w:t xml:space="preserve"> </w:t>
+      </w:r>
+    </w:p>
+    <w:p>
+      <w:r>
+        <w:lastRenderedPageBreak/>
+        <w:t>G</w:t>
+      </w:r>
+      <w:r>
+        <w:t xml:space="preserve">iới thệ châu viêm Bồ Đề hoà mãn. </w:t>
+      </w:r>
+    </w:p>
+    <w:p>
+      <w:r>
+        <w:t xml:space="preserve">Ngưỡng </w:t>
+      </w:r>
+      <w:r>
+        <w:t>mong</w:t>
+      </w:r>
+      <w:r>
+        <w:t xml:space="preserve"> mong oai đức từ bi xót </w:t>
+      </w:r>
+    </w:p>
+    <w:p>
+      <w:r>
+        <w:t>Nam mô Hương cúng Dường Bồ Tát</w:t>
+      </w:r>
+    </w:p>
+    <w:p>
+      <w:r>
+        <w:t xml:space="preserve">Nam mô Chứng minh </w:t>
+      </w:r>
+      <w:r>
+        <w:t>S</w:t>
+      </w:r>
+      <w:r>
+        <w:t>ư Bồ Tát</w:t>
+      </w:r>
+    </w:p>
+    <w:p>
+      <w:bookmarkStart w:id="1" w:name="_Hlk215727541"/>
+      <w:r>
+        <w:t>Nam mô Thập phương thường trụ Tam Bảo Tát Đại Chứng Minh</w:t>
+      </w:r>
+    </w:p>
+    <w:bookmarkEnd w:id="1"/>
     <w:p>
       <w:pPr>
         <w:pStyle w:val="Heading1"/>
-        <w:numPr>
-          <w:ilvl w:val="0"/>
-          <w:numId w:val="10"/>
-        </w:numPr>
         <w:tabs>
           <w:tab w:val="left" w:pos="284"/>
         </w:tabs>
-        <w:ind w:left="0" w:firstLine="0"/>
-      </w:pPr>
-      <w:r>
-        <w:t xml:space="preserve">BẠCH PHẬT </w:t>
-      </w:r>
-    </w:p>
-    <w:p>
-      <w:r>
-        <w:t xml:space="preserve">Hôm nay </w:t>
+      </w:pPr>
+      <w:r>
+        <w:t xml:space="preserve"># </w:t>
+      </w:r>
+      <w:r>
+        <w:t>XƯNG TÁN ĐỨC PHẬT</w:t>
+      </w:r>
+      <w:r>
+        <w:t xml:space="preserve"> 02:55</w:t>
       </w:r>
       <w:r>
         <w:t xml:space="preserve"> </w:t>
       </w:r>
-      <w:r>
-        <w:t xml:space="preserve">đệ tử chúng con </w:t>
-      </w:r>
-      <w:r>
-        <w:t xml:space="preserve">một dạ </w:t>
-      </w:r>
-      <w:r>
-        <w:t>C</w:t>
-      </w:r>
-      <w:r>
-        <w:t xml:space="preserve">hí thành phụng đối trước </w:t>
-      </w:r>
-      <w:r>
-        <w:t>T</w:t>
-      </w:r>
-      <w:r>
-        <w:t xml:space="preserve">am </w:t>
-      </w:r>
-      <w:r>
-        <w:t>B</w:t>
-      </w:r>
-      <w:r>
-        <w:t xml:space="preserve">ảo. </w:t>
-      </w:r>
-    </w:p>
-    <w:p>
-      <w:r>
-        <w:t xml:space="preserve">Chí thành </w:t>
-      </w:r>
-      <w:r>
-        <w:t>T</w:t>
-      </w:r>
-      <w:r>
-        <w:t>rì tụng kinh chí Xưng niệ</w:t>
-      </w:r>
-      <w:r>
-        <w:t>m</w:t>
-      </w:r>
-      <w:r>
-        <w:t xml:space="preserve"> Hồng Danh </w:t>
-      </w:r>
-    </w:p>
-    <w:p>
-      <w:r>
-        <w:t>Nguyện hồi hướng c</w:t>
-      </w:r>
-      <w:r>
-        <w:t>ô</w:t>
-      </w:r>
-      <w:r>
-        <w:t>ng đức</w:t>
-      </w:r>
-      <w:r>
-        <w:t xml:space="preserve"> </w:t>
-      </w:r>
-    </w:p>
-    <w:p>
-      <w:r>
-        <w:t>Kỳ nguyện thế giới hoà bình</w:t>
-      </w:r>
-      <w:r>
-        <w:t xml:space="preserve"> </w:t>
-      </w:r>
-    </w:p>
-    <w:p>
-      <w:r>
-        <w:t>Chúng sinh an lạc</w:t>
-      </w:r>
-      <w:r>
-        <w:t xml:space="preserve">. </w:t>
-      </w:r>
-    </w:p>
-    <w:p>
-      <w:r>
-        <w:t>Cửa thiền thanh tịnh đại chúng an hoà</w:t>
-      </w:r>
-      <w:r>
-        <w:t xml:space="preserve">. </w:t>
-      </w:r>
-    </w:p>
-    <w:p>
-      <w:r>
-        <w:t>Tất cả chúng con nghiệp chướng tiêu trừ thanh tâm an tịnh, bệnh khổ tiêu tan.</w:t>
-      </w:r>
-    </w:p>
-    <w:p>
-      <w:r>
-        <w:t>Quyến thuộc bình an kiết tường như ý</w:t>
-      </w:r>
-      <w:r>
-        <w:t>.</w:t>
-      </w:r>
-    </w:p>
-    <w:p>
-      <w:r>
-        <w:t>Tinh tấn tu học phúc tuệ trang nghiê</w:t>
-      </w:r>
-      <w:r>
-        <w:t>m</w:t>
-      </w:r>
-      <w:r>
-        <w:t xml:space="preserve"> </w:t>
-      </w:r>
-    </w:p>
-    <w:p>
-      <w:r>
-        <w:lastRenderedPageBreak/>
-        <w:t>G</w:t>
-      </w:r>
-      <w:r>
-        <w:t xml:space="preserve">iới thệ châu viêm Bồ Đề hoà mãn. </w:t>
-      </w:r>
-    </w:p>
-    <w:p>
-      <w:r>
-        <w:t xml:space="preserve">Ngưỡng </w:t>
-      </w:r>
-      <w:r>
-        <w:t>mong</w:t>
-      </w:r>
-      <w:r>
-        <w:t xml:space="preserve"> mong oai đức từ bi xót </w:t>
-      </w:r>
-    </w:p>
-    <w:p>
-      <w:r>
-        <w:t>Nam mô Hương cúng Dường Bồ Tát</w:t>
-      </w:r>
-    </w:p>
-    <w:p>
-      <w:r>
-        <w:t xml:space="preserve">Nam mô </w:t>
-      </w:r>
-      <w:r>
-        <w:t xml:space="preserve">Chứng minh </w:t>
-      </w:r>
-      <w:r>
-        <w:t>S</w:t>
-      </w:r>
-      <w:r>
-        <w:t>ư</w:t>
-      </w:r>
-      <w:r>
-        <w:t xml:space="preserve"> Bồ Tát</w:t>
-      </w:r>
-    </w:p>
-    <w:p>
-      <w:bookmarkStart w:id="0" w:name="_Hlk215727541"/>
-      <w:r>
-        <w:t xml:space="preserve">Nam mô </w:t>
-      </w:r>
-      <w:r>
-        <w:t>Thập phương thường trụ</w:t>
-      </w:r>
-      <w:r>
-        <w:t xml:space="preserve"> </w:t>
-      </w:r>
-      <w:r>
-        <w:t>Tam Bảo</w:t>
-      </w:r>
-      <w:r>
-        <w:t xml:space="preserve"> Tát</w:t>
-      </w:r>
-      <w:r>
-        <w:t xml:space="preserve"> Đại Chứng Minh</w:t>
-      </w:r>
-    </w:p>
-    <w:bookmarkEnd w:id="0"/>
+    </w:p>
+    <w:p>
+      <w:r>
+        <w:t xml:space="preserve">Đấng pháp vương vô thượng, ba cõi chẳng ai bằng. </w:t>
+      </w:r>
+    </w:p>
+    <w:p>
+      <w:r>
+        <w:t xml:space="preserve">Thầy dạy khắp trời người, cha lành chung bốn loại. </w:t>
+      </w:r>
+    </w:p>
+    <w:p>
+      <w:r>
+        <w:t xml:space="preserve">Quy y trọn một niệm, dứt sạch nghiệp ba kỳ. </w:t>
+      </w:r>
+    </w:p>
+    <w:p>
+      <w:r>
+        <w:t xml:space="preserve">Xưng dương cùng tán thán, ức kiếp không cùng tận.  </w:t>
+      </w:r>
+    </w:p>
     <w:p>
       <w:pPr>
         <w:pStyle w:val="Heading1"/>
-        <w:numPr>
-          <w:ilvl w:val="0"/>
-          <w:numId w:val="10"/>
-        </w:numPr>
         <w:tabs>
           <w:tab w:val="left" w:pos="284"/>
         </w:tabs>
-        <w:ind w:left="0" w:firstLine="0"/>
-      </w:pPr>
-      <w:r>
-        <w:t xml:space="preserve">XƯNG TÁN ĐỨC PHẬT </w:t>
-      </w:r>
-    </w:p>
-    <w:p>
-      <w:r>
-        <w:t xml:space="preserve">Đấng pháp vương vô thượng, ba cõi chẳng ai bằng. </w:t>
-      </w:r>
-    </w:p>
-    <w:p>
-      <w:r>
-        <w:t xml:space="preserve">Thầy dạy khắp trời người, cha lành chung bốn loại. </w:t>
-      </w:r>
-    </w:p>
-    <w:p>
-      <w:r>
-        <w:t xml:space="preserve">Quy y trọn một niệm, dứt sạch nghiệp ba kỳ. </w:t>
-      </w:r>
-    </w:p>
-    <w:p>
-      <w:r>
-        <w:t xml:space="preserve">Xưng dương cùng tán thán, ức kiếp không cùng tận.  </w:t>
-      </w:r>
-    </w:p>
-    <w:p>
-      <w:pPr>
-        <w:pStyle w:val="Heading1"/>
+      </w:pPr>
+      <w:r>
+        <w:t xml:space="preserve"># </w:t>
+      </w:r>
+      <w:r>
+        <w:t>QUÁN TƯỞNG</w:t>
+      </w:r>
+      <w:r>
+        <w:t xml:space="preserve"> 03:38</w:t>
+      </w:r>
+      <w:r>
+        <w:t xml:space="preserve"> </w:t>
+      </w:r>
+    </w:p>
+    <w:p>
+      <w:r>
+        <w:t xml:space="preserve">Phật, chúng sanh tánh thường rỗng lặng </w:t>
+      </w:r>
+    </w:p>
+    <w:p>
+      <w:r>
+        <w:t xml:space="preserve">Đạo cảm thông không thể nghĩ bàn </w:t>
+      </w:r>
+    </w:p>
+    <w:p>
+      <w:r>
+        <w:t xml:space="preserve">Lưới đế châu ví đạo tràng </w:t>
+      </w:r>
+    </w:p>
+    <w:p>
+      <w:r>
+        <w:t xml:space="preserve">Mười phương Phật bảo hào quang sáng ngời </w:t>
+      </w:r>
+    </w:p>
+    <w:p>
+      <w:r>
+        <w:t xml:space="preserve">Trước bảo tọa thân con ảnh hiện </w:t>
+      </w:r>
+    </w:p>
+    <w:p>
+      <w:r>
+        <w:t xml:space="preserve">Cúi đầu xin thệ nguyện quy y </w:t>
+      </w:r>
+    </w:p>
+    <w:p>
+      <w:pPr>
+        <w:pStyle w:val="ListParagraph"/>
         <w:numPr>
           <w:ilvl w:val="0"/>
-          <w:numId w:val="10"/>
+          <w:numId w:val="12"/>
         </w:numPr>
+      </w:pPr>
+      <w:r>
+        <w:t xml:space="preserve">tiếng chuông, 1 xá) </w:t>
+      </w:r>
+    </w:p>
+    <w:p>
+      <w:pPr>
+        <w:pStyle w:val="Heading1"/>
         <w:tabs>
           <w:tab w:val="left" w:pos="284"/>
         </w:tabs>
-        <w:ind w:left="0" w:firstLine="0"/>
-      </w:pPr>
-      <w:r>
-        <w:t xml:space="preserve">QUÁN TƯỞNG </w:t>
-      </w:r>
-    </w:p>
-    <w:p>
-      <w:r>
-        <w:t xml:space="preserve">Phật, chúng sanh tánh thường rỗng lặng </w:t>
-      </w:r>
-    </w:p>
-    <w:p>
-      <w:r>
-        <w:t xml:space="preserve">Đạo cảm thông không thể nghĩ bàn </w:t>
-      </w:r>
-    </w:p>
-    <w:p>
-      <w:r>
-        <w:t xml:space="preserve">Lưới đế châu ví đạo tràng </w:t>
-      </w:r>
-    </w:p>
-    <w:p>
-      <w:r>
-        <w:t xml:space="preserve">Mười phương Phật bảo hào quang sáng ngời </w:t>
-      </w:r>
-    </w:p>
-    <w:p>
-      <w:r>
-        <w:t xml:space="preserve">Trước bảo tọa thân con ảnh hiện </w:t>
-      </w:r>
-    </w:p>
-    <w:p>
-      <w:r>
-        <w:t xml:space="preserve">Cúi đầu xin thệ nguyện quy y </w:t>
-      </w:r>
-    </w:p>
-    <w:p>
-      <w:r>
-        <w:t xml:space="preserve">(1 tiếng chuông, 1 xá) </w:t>
+      </w:pPr>
+      <w:r>
+        <w:t xml:space="preserve"># </w:t>
+      </w:r>
+      <w:r>
+        <w:t>ĐẢNH LỄ TAM BẢO</w:t>
+      </w:r>
+      <w:r>
+        <w:t xml:space="preserve"> 04:15</w:t>
+      </w:r>
+    </w:p>
+    <w:p>
+      <w:r>
+        <w:t xml:space="preserve">Chí tâm đảnh lễ: </w:t>
+      </w:r>
+      <w:r>
+        <w:t>T</w:t>
+      </w:r>
+      <w:r>
+        <w:t xml:space="preserve">ận hư không biến pháp giới quá, hiện, vị lai Thập phương chư Phật, Tôn Pháp, Hiền Thánh Tăng thường trụ Tam Bảo (1 lạy). </w:t>
+      </w:r>
+    </w:p>
+    <w:p>
+      <w:r>
+        <w:t xml:space="preserve">Chí tâm đảnh lễ: Ta-bà giáo chủ điều ngự Bổn sư Thích-ca Mâu-ni Phật, Đương lai hạ sinh Di-lặc tôn Phật, Đại trí Văn-thù Sư-lợi Bồ-tát, Đại hạnh Phổ Hiền Bồ-tát, Hộ pháp chư tôn Bồ-tát, </w:t>
+      </w:r>
+      <w:r>
+        <w:t>Kỳ Viên</w:t>
+      </w:r>
+      <w:r>
+        <w:t xml:space="preserve"> hội thượng Phật Bồ-tát (1 lạy). </w:t>
+      </w:r>
+    </w:p>
+    <w:p>
+      <w:r>
+        <w:lastRenderedPageBreak/>
+        <w:t xml:space="preserve">Chí tâm đảnh lễ: Tây Phương Cực Lạc thế giới </w:t>
+      </w:r>
+      <w:r>
+        <w:t xml:space="preserve">Giáo chủ </w:t>
+      </w:r>
+      <w:r>
+        <w:t xml:space="preserve">Đại từ Đại bi A-di-đà Phật, </w:t>
+      </w:r>
+    </w:p>
+    <w:p>
+      <w:r>
+        <w:t xml:space="preserve">Đại bi Quán Thế Âm Bồ-tát, </w:t>
+      </w:r>
+    </w:p>
+    <w:p>
+      <w:bookmarkStart w:id="2" w:name="_Hlk215728591"/>
+      <w:bookmarkStart w:id="3" w:name="_Hlk215728646"/>
+      <w:r>
+        <w:t xml:space="preserve">Đại </w:t>
+      </w:r>
+      <w:bookmarkEnd w:id="2"/>
+      <w:r>
+        <w:t xml:space="preserve">lực Đại </w:t>
+      </w:r>
+      <w:r>
+        <w:t xml:space="preserve">Thế Chí Bồ-tát, </w:t>
+      </w:r>
+    </w:p>
+    <w:bookmarkEnd w:id="3"/>
+    <w:p>
+      <w:r>
+        <w:t xml:space="preserve">Đại nguyện Địa Tạng Vương Bồ-tát, </w:t>
+      </w:r>
+    </w:p>
+    <w:p>
+      <w:r>
+        <w:t xml:space="preserve">Thanh tịnh </w:t>
+      </w:r>
+      <w:r>
+        <w:t>Đ</w:t>
+      </w:r>
+      <w:r>
+        <w:t xml:space="preserve">ại </w:t>
+      </w:r>
+      <w:r>
+        <w:t>H</w:t>
+      </w:r>
+      <w:r>
+        <w:t xml:space="preserve">ải </w:t>
+      </w:r>
+      <w:r>
+        <w:t>C</w:t>
+      </w:r>
+      <w:r>
+        <w:t>húng Bồ-tát (1 lạy).</w:t>
       </w:r>
     </w:p>
     <w:p>
       <w:pPr>
         <w:pStyle w:val="Heading1"/>
-        <w:numPr>
-          <w:ilvl w:val="0"/>
-          <w:numId w:val="10"/>
-        </w:numPr>
         <w:tabs>
           <w:tab w:val="left" w:pos="284"/>
         </w:tabs>
-        <w:ind w:left="0" w:firstLine="0"/>
-      </w:pPr>
-      <w:r>
-        <w:t>ĐẢNH LỄ TAM BẢO</w:t>
-      </w:r>
-    </w:p>
-    <w:p>
-      <w:r>
-        <w:t xml:space="preserve">Chí tâm đảnh lễ: </w:t>
-      </w:r>
-      <w:r>
-        <w:t>T</w:t>
-      </w:r>
-      <w:r>
-        <w:t xml:space="preserve">ận hư không biến pháp giới quá, hiện, vị lai Thập phương chư Phật, Tôn Pháp, Hiền Thánh Tăng thường trụ Tam Bảo (1 lạy). </w:t>
-      </w:r>
-    </w:p>
-    <w:p>
-      <w:r>
-        <w:t xml:space="preserve">Chí tâm đảnh lễ: Ta-bà giáo chủ điều ngự Bổn sư Thích-ca Mâu-ni Phật, Đương lai hạ sinh Di-lặc tôn Phật, Đại trí Văn-thù Sư-lợi Bồ-tát, Đại hạnh Phổ Hiền Bồ-tát, Hộ pháp chư tôn Bồ-tát, </w:t>
-      </w:r>
-      <w:r>
-        <w:t>Kỳ Viên</w:t>
-      </w:r>
-      <w:r>
-        <w:t xml:space="preserve"> hội thượng Phật Bồ-tát (1 lạy). </w:t>
-      </w:r>
-    </w:p>
-    <w:p>
-      <w:r>
+      </w:pPr>
+      <w:r>
+        <w:t xml:space="preserve"># </w:t>
+      </w:r>
+      <w:r>
+        <w:t>CHÚ ĐẠI BI</w:t>
+      </w:r>
+      <w:r>
+        <w:t xml:space="preserve"> 06:15</w:t>
+      </w:r>
+    </w:p>
+    <w:p>
+      <w:r>
+        <w:t xml:space="preserve">Nam-Mô Đại Bi hội thượng Phật, Bồ tát (3 lần) </w:t>
+      </w:r>
+    </w:p>
+    <w:p>
+      <w:r>
+        <w:t xml:space="preserve">Thiên thủ thiên nhãn, vô ngại đại bi tâm, đà </w:t>
+      </w:r>
+      <w:bookmarkStart w:id="4" w:name="_Hlk215730660"/>
+      <w:r>
+        <w:t>l</w:t>
+      </w:r>
+      <w:r>
+        <w:t>a ni</w:t>
+      </w:r>
+      <w:bookmarkEnd w:id="4"/>
+      <w:r>
+        <w:t xml:space="preserve">. </w:t>
+      </w:r>
+    </w:p>
+    <w:p>
+      <w:r>
+        <w:t>Nam-Mô hắc ra đát na, đa</w:t>
+      </w:r>
+      <w:r>
+        <w:t xml:space="preserve"> </w:t>
+      </w:r>
+      <w:r>
+        <w:t xml:space="preserve">ra dạ da. </w:t>
+      </w:r>
+    </w:p>
+    <w:p>
+      <w:pPr>
+        <w:rPr>
+          <w:lang w:val="de-DE"/>
+        </w:rPr>
+      </w:pPr>
+      <w:r>
+        <w:t xml:space="preserve">Nam-Mô </w:t>
+      </w:r>
+      <w:r>
+        <w:t xml:space="preserve">a rị </w:t>
+      </w:r>
+      <w:r>
+        <w:t>da, bà lô kiết đế,</w:t>
+      </w:r>
+      <w:r>
+        <w:t xml:space="preserve"> </w:t>
+      </w:r>
+      <w:r>
+        <w:t xml:space="preserve">thước bát ra da. </w:t>
+      </w:r>
+      <w:r>
+        <w:rPr>
+          <w:lang w:val="de-DE"/>
+        </w:rPr>
+        <w:t xml:space="preserve">Bồ đề tát đỏa bà da. Ma ha tát đỏa bà da. Ma ha ca lô ni ca da. </w:t>
+      </w:r>
+    </w:p>
+    <w:p>
+      <w:pPr>
+        <w:rPr>
+          <w:lang w:val="de-DE"/>
+        </w:rPr>
+      </w:pPr>
+      <w:r>
+        <w:rPr>
+          <w:lang w:val="de-DE"/>
+        </w:rPr>
+        <w:t>Án tát bàn ra phạt duệ, số đát na đát tỏa. </w:t>
+      </w:r>
+      <w:r>
+        <w:rPr>
+          <w:lang w:val="de-DE"/>
+        </w:rPr>
+        <w:t>Nam-Mô</w:t>
+      </w:r>
+      <w:r>
+        <w:rPr>
+          <w:lang w:val="de-DE"/>
+        </w:rPr>
+        <w:t xml:space="preserve"> tất kiết lật đỏa y mông, </w:t>
+      </w:r>
+      <w:r>
+        <w:rPr>
+          <w:lang w:val="de-DE"/>
+        </w:rPr>
+        <w:t>a rị da</w:t>
+      </w:r>
+      <w:r>
+        <w:rPr>
+          <w:lang w:val="de-DE"/>
+        </w:rPr>
+        <w:t xml:space="preserve"> bà lô kiết đế, thất Phật </w:t>
+      </w:r>
+    </w:p>
+    <w:p>
+      <w:pPr>
+        <w:rPr>
+          <w:lang w:val="de-DE"/>
+        </w:rPr>
+      </w:pPr>
+      <w:r>
+        <w:rPr>
+          <w:lang w:val="de-DE"/>
+        </w:rPr>
+        <w:t xml:space="preserve">ra lăng đà bà. Nam-Mô na ra cẩn trì, </w:t>
+      </w:r>
+      <w:r>
+        <w:rPr>
+          <w:lang w:val="de-DE"/>
+        </w:rPr>
+        <w:t xml:space="preserve">hê rị </w:t>
+      </w:r>
+      <w:r>
+        <w:rPr>
+          <w:lang w:val="de-DE"/>
+        </w:rPr>
+        <w:t>ma ha bàn đà sa mế. Tát bà a tha đậu</w:t>
+      </w:r>
+      <w:r>
+        <w:rPr>
+          <w:lang w:val="de-DE"/>
+        </w:rPr>
+        <w:t xml:space="preserve"> du</w:t>
+      </w:r>
+      <w:r>
+        <w:rPr>
+          <w:lang w:val="de-DE"/>
+        </w:rPr>
+        <w:t xml:space="preserve"> bằng a thệ dựng, tát b</w:t>
+      </w:r>
+      <w:r>
+        <w:rPr>
+          <w:lang w:val="de-DE"/>
+        </w:rPr>
+        <w:t>à</w:t>
+      </w:r>
+      <w:r>
+        <w:rPr>
+          <w:lang w:val="de-DE"/>
+        </w:rPr>
+        <w:t xml:space="preserve"> </w:t>
+      </w:r>
+    </w:p>
+    <w:p>
+      <w:pPr>
+        <w:rPr>
+          <w:lang w:val="de-DE"/>
+        </w:rPr>
+      </w:pPr>
+      <w:r>
+        <w:rPr>
+          <w:lang w:val="de-DE"/>
+        </w:rPr>
+        <w:t>tát đ</w:t>
+      </w:r>
+      <w:r>
+        <w:rPr>
+          <w:lang w:val="de-DE"/>
+        </w:rPr>
+        <w:t>a</w:t>
+      </w:r>
+      <w:r>
+        <w:rPr>
+          <w:lang w:val="de-DE"/>
+        </w:rPr>
+        <w:t xml:space="preserve">, na ma bà dà, ma phạt đạt đậu, đát điệt tha. </w:t>
+      </w:r>
+      <w:r>
+        <w:rPr>
+          <w:lang w:val="de-DE"/>
+        </w:rPr>
+        <w:t>Á</w:t>
+      </w:r>
+      <w:r>
+        <w:rPr>
+          <w:lang w:val="de-DE"/>
+        </w:rPr>
+        <w:t xml:space="preserve">n a bà lô hê lô ca đế, ca ra đế, di hê </w:t>
+      </w:r>
+      <w:r>
+        <w:rPr>
+          <w:lang w:val="de-DE"/>
+        </w:rPr>
+        <w:t>r</w:t>
+      </w:r>
+      <w:r>
+        <w:rPr>
+          <w:lang w:val="de-DE"/>
+        </w:rPr>
+        <w:t>ị. Ma ha bồ đề </w:t>
+      </w:r>
+    </w:p>
+    <w:p>
+      <w:pPr>
+        <w:rPr>
+          <w:lang w:val="de-DE"/>
+        </w:rPr>
+      </w:pPr>
+      <w:r>
+        <w:rPr>
+          <w:lang w:val="de-DE"/>
+        </w:rPr>
+        <w:t xml:space="preserve">tát đỏa, tát bà tát bà, ma ra ma ra, ma hê ma </w:t>
+      </w:r>
+      <w:r>
+        <w:rPr>
+          <w:lang w:val="de-DE"/>
+        </w:rPr>
+        <w:t xml:space="preserve">hê rị </w:t>
+      </w:r>
+      <w:r>
+        <w:rPr>
+          <w:lang w:val="de-DE"/>
+        </w:rPr>
+        <w:t xml:space="preserve">đà dựng. Câu lô câu lô kiết mông. Độ lô độ lô phạt xà da đế, </w:t>
+      </w:r>
+    </w:p>
+    <w:p>
+      <w:pPr>
+        <w:rPr>
+          <w:lang w:val="de-DE"/>
+        </w:rPr>
+      </w:pPr>
+      <w:r>
+        <w:rPr>
+          <w:lang w:val="de-DE"/>
+        </w:rPr>
+        <w:t xml:space="preserve">ma ha phạt xa da đế. Đà ra đà ra địa ri ni, thất phật ra da. Giá ra giá ra. </w:t>
+      </w:r>
+    </w:p>
+    <w:p>
+      <w:pPr>
+        <w:rPr>
+          <w:lang w:val="de-DE"/>
+        </w:rPr>
+      </w:pPr>
+      <w:r>
+        <w:rPr>
+          <w:lang w:val="de-DE"/>
+        </w:rPr>
+        <w:t xml:space="preserve">Mạ mạ phạt ma ra, mục đế lệ. Y hê di hê, </w:t>
+      </w:r>
+    </w:p>
+    <w:p>
+      <w:pPr>
+        <w:rPr>
+          <w:lang w:val="de-DE"/>
+        </w:rPr>
+      </w:pPr>
+      <w:r>
+        <w:rPr>
+          <w:lang w:val="de-DE"/>
+        </w:rPr>
+        <w:t xml:space="preserve">thất na thất na, a ra sâm phật ra xá lợi, phạt sa phạt sâm. Phật ra xá da. Hô lô hô lô, ma ra hô lô hô lô hê rị. Ta ra ta ra, tất rị </w:t>
+      </w:r>
+    </w:p>
+    <w:p>
+      <w:pPr>
+        <w:rPr>
+          <w:lang w:val="de-DE"/>
+        </w:rPr>
+      </w:pPr>
+      <w:r>
+        <w:rPr>
+          <w:lang w:val="de-DE"/>
+        </w:rPr>
+        <w:t xml:space="preserve">tất rị, tô rô tô rô. Bồ đề dạ, bồ đề dạ, bồ đà dạ, bồ đà dạ. Di đế rị dạ. Na ra cẩn trì địa rị sắc </w:t>
+      </w:r>
+    </w:p>
+    <w:p>
+      <w:pPr>
+        <w:rPr>
+          <w:lang w:val="de-DE"/>
+        </w:rPr>
+      </w:pPr>
+      <w:r>
+        <w:rPr>
+          <w:lang w:val="de-DE"/>
+        </w:rPr>
         <w:lastRenderedPageBreak/>
-        <w:t xml:space="preserve">Chí tâm đảnh lễ: Tây Phương Cực Lạc thế giới </w:t>
-      </w:r>
-      <w:r>
-        <w:t xml:space="preserve">Giáo chủ </w:t>
-      </w:r>
-      <w:r>
-        <w:t xml:space="preserve">Đại từ Đại bi A-di-đà Phật, </w:t>
-      </w:r>
-    </w:p>
-    <w:p>
-      <w:r>
-        <w:t xml:space="preserve">Đại bi Quán Thế Âm Bồ-tát, </w:t>
-      </w:r>
-    </w:p>
-    <w:p>
-      <w:bookmarkStart w:id="1" w:name="_Hlk215728591"/>
-      <w:bookmarkStart w:id="2" w:name="_Hlk215728646"/>
-      <w:r>
-        <w:t xml:space="preserve">Đại </w:t>
-      </w:r>
-      <w:bookmarkEnd w:id="1"/>
-      <w:r>
-        <w:t xml:space="preserve">lực </w:t>
-      </w:r>
-      <w:r>
-        <w:t xml:space="preserve">Đại </w:t>
-      </w:r>
-      <w:r>
-        <w:t xml:space="preserve">Thế Chí Bồ-tát, </w:t>
-      </w:r>
-    </w:p>
-    <w:bookmarkEnd w:id="2"/>
-    <w:p>
-      <w:r>
-        <w:t xml:space="preserve">Đại nguyện Địa Tạng Vương Bồ-tát, </w:t>
-      </w:r>
-    </w:p>
-    <w:p>
-      <w:r>
-        <w:t xml:space="preserve">Thanh tịnh </w:t>
-      </w:r>
-      <w:r>
-        <w:t>Đ</w:t>
-      </w:r>
-      <w:r>
-        <w:t xml:space="preserve">ại </w:t>
-      </w:r>
-      <w:r>
-        <w:t>H</w:t>
-      </w:r>
-      <w:r>
-        <w:t xml:space="preserve">ải </w:t>
-      </w:r>
-      <w:r>
-        <w:t>C</w:t>
-      </w:r>
-      <w:r>
-        <w:t>húng Bồ-tát (1 lạy).</w:t>
+        <w:t xml:space="preserve">ni na. Ba dạ ma na, ta bà ha Tất đà dạ ta bà ha Ma ha tất đà dạ ta bà ha Tất đà du nghệ thất bàn ra da ta bà ha </w:t>
+      </w:r>
+    </w:p>
+    <w:p>
+      <w:pPr>
+        <w:rPr>
+          <w:lang w:val="de-DE"/>
+        </w:rPr>
+      </w:pPr>
+      <w:r>
+        <w:rPr>
+          <w:lang w:val="de-DE"/>
+        </w:rPr>
+        <w:t xml:space="preserve">Na ra cẩn trì ta bà ha ta bà ha. Tất đà dạ ta bà ha, Ma ha tất đà dạ ta bà ha. Tất đà du nghệ thất bàn ra da, ta bà ha. </w:t>
+      </w:r>
+    </w:p>
+    <w:p>
+      <w:pPr>
+        <w:rPr>
+          <w:lang w:val="de-DE"/>
+        </w:rPr>
+      </w:pPr>
+      <w:r>
+        <w:rPr>
+          <w:lang w:val="de-DE"/>
+        </w:rPr>
+        <w:t>Na ra cẩn trì, ta bà ha. Ma ra na ra ta bà ha. Tất ra tăng a mục kh</w:t>
+      </w:r>
+      <w:r>
+        <w:rPr>
+          <w:lang w:val="de-DE"/>
+        </w:rPr>
+        <w:t>ế</w:t>
+      </w:r>
+      <w:r>
+        <w:rPr>
+          <w:lang w:val="de-DE"/>
+        </w:rPr>
+        <w:t xml:space="preserve"> da ta bà ha, ta bà ma ha a tất đà dạ ta bà ha. Giả kiết </w:t>
+      </w:r>
+    </w:p>
+    <w:p>
+      <w:pPr>
+        <w:rPr>
+          <w:lang w:val="de-DE"/>
+        </w:rPr>
+      </w:pPr>
+      <w:r>
+        <w:rPr>
+          <w:lang w:val="de-DE"/>
+        </w:rPr>
+        <w:t xml:space="preserve">ra a tất đà dạ ta bà ha. Ba đà ma yết tất đà dạ, ta bà ha. Na ra cẩn trì bàn đà ra dạ, </w:t>
+      </w:r>
+    </w:p>
+    <w:p>
+      <w:pPr>
+        <w:rPr>
+          <w:lang w:val="de-DE"/>
+        </w:rPr>
+      </w:pPr>
+      <w:r>
+        <w:rPr>
+          <w:lang w:val="de-DE"/>
+        </w:rPr>
+        <w:t xml:space="preserve">ta bà ha. </w:t>
+      </w:r>
+    </w:p>
+    <w:p>
+      <w:pPr>
+        <w:rPr>
+          <w:lang w:val="de-DE"/>
+        </w:rPr>
+      </w:pPr>
+      <w:r>
+        <w:rPr>
+          <w:lang w:val="de-DE"/>
+        </w:rPr>
+        <w:t>Ma bà l</w:t>
+      </w:r>
+      <w:r>
+        <w:rPr>
+          <w:lang w:val="de-DE"/>
+        </w:rPr>
+        <w:t>ợi</w:t>
+      </w:r>
+      <w:r>
+        <w:rPr>
+          <w:lang w:val="de-DE"/>
+        </w:rPr>
+        <w:t xml:space="preserve"> thắng kiết ra dạ, ta bà ha. Nam-Mô hắc ra đát na đa ra dạ da. Nam-Mô </w:t>
+      </w:r>
+      <w:r>
+        <w:rPr>
+          <w:lang w:val="de-DE"/>
+        </w:rPr>
+        <w:t xml:space="preserve">a rị </w:t>
+      </w:r>
+      <w:r>
+        <w:rPr>
+          <w:lang w:val="de-DE"/>
+        </w:rPr>
+        <w:t xml:space="preserve">da bà lô kiết đế, thước bàn ra dạ ta bà ha. </w:t>
+      </w:r>
+    </w:p>
+    <w:p>
+      <w:pPr>
+        <w:rPr>
+          <w:lang w:val="de-DE"/>
+        </w:rPr>
+      </w:pPr>
+      <w:r>
+        <w:rPr>
+          <w:lang w:val="de-DE"/>
+        </w:rPr>
+        <w:t xml:space="preserve">Án tất điện đô, mạn đa ra, bạt đà dạ, ta bà ha. ( 3 lần) </w:t>
+      </w:r>
+    </w:p>
+    <w:p>
+      <w:pPr>
+        <w:rPr>
+          <w:lang w:val="de-DE"/>
+        </w:rPr>
+      </w:pPr>
+      <w:r>
+        <w:rPr>
+          <w:lang w:val="de-DE"/>
+        </w:rPr>
+        <w:t xml:space="preserve">Nam mô Thập phương Thường trụ Tam bảo ( 3 lần) </w:t>
+      </w:r>
+    </w:p>
+    <w:p>
+      <w:pPr>
+        <w:rPr>
+          <w:lang w:val="de-DE"/>
+        </w:rPr>
+      </w:pPr>
+      <w:r>
+        <w:rPr>
+          <w:lang w:val="de-DE"/>
+        </w:rPr>
+        <w:t># KHAI KINH QUÁN THẾ ÂM 10:48</w:t>
+      </w:r>
+    </w:p>
+    <w:p>
+      <w:pPr>
+        <w:rPr>
+          <w:lang w:val="de-DE"/>
+        </w:rPr>
+      </w:pPr>
+      <w:r>
+        <w:rPr>
+          <w:lang w:val="de-DE"/>
+        </w:rPr>
+        <w:t>Trí tuệ bừng lên đóa biện tài,</w:t>
+      </w:r>
+    </w:p>
+    <w:p>
+      <w:pPr>
+        <w:rPr>
+          <w:lang w:val="de-DE"/>
+        </w:rPr>
+      </w:pPr>
+      <w:r>
+        <w:rPr>
+          <w:lang w:val="de-DE"/>
+        </w:rPr>
+        <w:t>Đứng yên trên sóng sạch trần ai,</w:t>
+      </w:r>
+    </w:p>
+    <w:p>
+      <w:pPr>
+        <w:rPr>
+          <w:lang w:val="de-DE"/>
+        </w:rPr>
+      </w:pPr>
+      <w:r>
+        <w:rPr>
+          <w:lang w:val="de-DE"/>
+        </w:rPr>
+        <w:t>Cam lộ chữa lành cơn khổ bệnh,</w:t>
+      </w:r>
+    </w:p>
+    <w:p>
+      <w:pPr>
+        <w:rPr>
+          <w:lang w:val="de-DE"/>
+        </w:rPr>
+      </w:pPr>
+      <w:r>
+        <w:rPr>
+          <w:lang w:val="de-DE"/>
+        </w:rPr>
+        <w:t>Hào quang quét sạch buổi nguy tai.</w:t>
+      </w:r>
+    </w:p>
+    <w:p>
+      <w:pPr>
+        <w:rPr>
+          <w:lang w:val="de-DE"/>
+        </w:rPr>
+      </w:pPr>
+      <w:r>
+        <w:rPr>
+          <w:lang w:val="de-DE"/>
+        </w:rPr>
+        <w:t>Liễu biếc phất bày muôn thế giới,</w:t>
+      </w:r>
+    </w:p>
+    <w:p>
+      <w:pPr>
+        <w:rPr>
+          <w:lang w:val="de-DE"/>
+        </w:rPr>
+      </w:pPr>
+      <w:r>
+        <w:rPr>
+          <w:lang w:val="de-DE"/>
+        </w:rPr>
+        <w:t>Sen hồng nở hé vạn lâu đài,</w:t>
+      </w:r>
+    </w:p>
+    <w:p>
+      <w:pPr>
+        <w:rPr>
+          <w:lang w:val="de-DE"/>
+        </w:rPr>
+      </w:pPr>
+      <w:r>
+        <w:rPr>
+          <w:lang w:val="de-DE"/>
+        </w:rPr>
+        <w:t>Cúi đầu ca ngợi dâng hương thỉnh,</w:t>
+      </w:r>
+    </w:p>
+    <w:p>
+      <w:pPr>
+        <w:rPr>
+          <w:lang w:val="de-DE"/>
+        </w:rPr>
+      </w:pPr>
+      <w:r>
+        <w:rPr>
+          <w:lang w:val="de-DE"/>
+        </w:rPr>
+        <w:t>Xin nguyện từ bi ứng hiện ngay.</w:t>
+      </w:r>
+    </w:p>
+    <w:p>
+      <w:pPr>
+        <w:rPr>
+          <w:lang w:val="de-DE"/>
+        </w:rPr>
+      </w:pPr>
+      <w:r>
+        <w:rPr>
+          <w:lang w:val="de-DE"/>
+        </w:rPr>
+        <w:t>Nam Mô Đại Bi Quán Thế Âm Bồ Tát.</w:t>
+      </w:r>
+      <w:r>
+        <w:rPr>
+          <w:lang w:val="de-DE"/>
+        </w:rPr>
+        <w:t xml:space="preserve"> (3 lần)</w:t>
       </w:r>
     </w:p>
     <w:p>
       <w:pPr>
         <w:pStyle w:val="Heading1"/>
-        <w:numPr>
-          <w:ilvl w:val="0"/>
-          <w:numId w:val="10"/>
-        </w:numPr>
         <w:tabs>
           <w:tab w:val="left" w:pos="284"/>
         </w:tabs>
-        <w:ind w:left="0" w:firstLine="0"/>
-      </w:pPr>
-      <w:r>
-        <w:t>CHÚ ĐẠI BI</w:t>
-      </w:r>
-    </w:p>
-    <w:p>
-      <w:r>
-        <w:t xml:space="preserve">Nam-Mô Đại Bi hội thượng Phật, Bồ tát (3 lần) </w:t>
-      </w:r>
-    </w:p>
-    <w:p>
-      <w:r>
-        <w:t xml:space="preserve">Thiên thủ thiên nhãn, vô ngại đại bi tâm, đà </w:t>
-      </w:r>
-      <w:bookmarkStart w:id="3" w:name="_Hlk215730660"/>
-      <w:r>
-        <w:t>l</w:t>
-      </w:r>
-      <w:r>
-        <w:t>a ni</w:t>
-      </w:r>
-      <w:bookmarkEnd w:id="3"/>
-      <w:r>
-        <w:t xml:space="preserve">. </w:t>
-      </w:r>
-    </w:p>
-    <w:p>
-      <w:r>
-        <w:t xml:space="preserve">Nam-Mô hắc ra đát na, đa ra dạ da. </w:t>
-      </w:r>
-    </w:p>
-    <w:p>
-      <w:pPr>
-        <w:rPr>
-          <w:lang w:val="de-DE"/>
-        </w:rPr>
-      </w:pPr>
-      <w:r>
-        <w:t xml:space="preserve">Nam-Mô </w:t>
-      </w:r>
-      <w:r>
-        <w:t xml:space="preserve">a rị </w:t>
-      </w:r>
-      <w:r>
-        <w:t xml:space="preserve">da, bà lô kiết đế, thước bát ra da. </w:t>
-      </w:r>
-      <w:r>
-        <w:rPr>
-          <w:lang w:val="de-DE"/>
-        </w:rPr>
-        <w:t xml:space="preserve">Bồ đề tát đỏa bà da. Ma ha tát đỏa bà da. Ma ha ca lô ni ca da. </w:t>
-      </w:r>
-    </w:p>
-    <w:p>
-      <w:pPr>
-        <w:rPr>
-          <w:lang w:val="de-DE"/>
-        </w:rPr>
-      </w:pPr>
-      <w:r>
-        <w:rPr>
-          <w:lang w:val="de-DE"/>
-        </w:rPr>
-        <w:t>Án tát bàn ra phạt duệ, số đát na đát tỏa. </w:t>
-      </w:r>
-      <w:r>
-        <w:rPr>
-          <w:lang w:val="de-DE"/>
-        </w:rPr>
-        <w:t>Nam-Mô</w:t>
-      </w:r>
-      <w:r>
-        <w:rPr>
-          <w:lang w:val="de-DE"/>
-        </w:rPr>
-        <w:t xml:space="preserve"> tất kiết lật đỏa y mông, </w:t>
-      </w:r>
-      <w:r>
-        <w:rPr>
-          <w:lang w:val="de-DE"/>
-        </w:rPr>
-        <w:t>a rị da</w:t>
-      </w:r>
-      <w:r>
-        <w:rPr>
-          <w:lang w:val="de-DE"/>
-        </w:rPr>
-        <w:t xml:space="preserve"> bà lô kiết đế, thất Phật </w:t>
-      </w:r>
-    </w:p>
-    <w:p>
-      <w:pPr>
-        <w:rPr>
-          <w:lang w:val="de-DE"/>
-        </w:rPr>
-      </w:pPr>
-      <w:r>
-        <w:rPr>
-          <w:lang w:val="de-DE"/>
-        </w:rPr>
-        <w:t xml:space="preserve">ra lăng đà bà. Nam-Mô na ra cẩn trì, </w:t>
-      </w:r>
-      <w:r>
-        <w:rPr>
-          <w:lang w:val="de-DE"/>
-        </w:rPr>
-        <w:t xml:space="preserve">hê rị </w:t>
-      </w:r>
-      <w:r>
-        <w:rPr>
-          <w:lang w:val="de-DE"/>
-        </w:rPr>
-        <w:t>ma ha bàn đà sa mế. Tát bà a tha đậu</w:t>
-      </w:r>
-      <w:r>
-        <w:rPr>
-          <w:lang w:val="de-DE"/>
-        </w:rPr>
-        <w:t xml:space="preserve"> du</w:t>
-      </w:r>
-      <w:r>
-        <w:rPr>
-          <w:lang w:val="de-DE"/>
-        </w:rPr>
-        <w:t xml:space="preserve"> bằng a thệ dựng, tát b</w:t>
-      </w:r>
-      <w:r>
-        <w:rPr>
-          <w:lang w:val="de-DE"/>
-        </w:rPr>
-        <w:t>à</w:t>
-      </w:r>
-      <w:r>
-        <w:rPr>
-          <w:lang w:val="de-DE"/>
-        </w:rPr>
-        <w:t xml:space="preserve"> </w:t>
-      </w:r>
-    </w:p>
-    <w:p>
-      <w:pPr>
-        <w:rPr>
-          <w:lang w:val="de-DE"/>
-        </w:rPr>
-      </w:pPr>
-      <w:r>
-        <w:rPr>
-          <w:lang w:val="de-DE"/>
-        </w:rPr>
-        <w:t>tát đ</w:t>
-      </w:r>
-      <w:r>
-        <w:rPr>
-          <w:lang w:val="de-DE"/>
-        </w:rPr>
-        <w:t>a</w:t>
-      </w:r>
-      <w:r>
-        <w:rPr>
-          <w:lang w:val="de-DE"/>
-        </w:rPr>
-        <w:t xml:space="preserve">, na ma bà dà, ma phạt đạt đậu, đát điệt tha. </w:t>
-      </w:r>
-      <w:r>
-        <w:rPr>
-          <w:lang w:val="de-DE"/>
-        </w:rPr>
-        <w:t>Á</w:t>
-      </w:r>
-      <w:r>
-        <w:rPr>
-          <w:lang w:val="de-DE"/>
-        </w:rPr>
-        <w:t xml:space="preserve">n a bà lô hê lô ca đế, ca ra đế, di hê </w:t>
-      </w:r>
-      <w:r>
-        <w:rPr>
-          <w:lang w:val="de-DE"/>
-        </w:rPr>
-        <w:t>r</w:t>
-      </w:r>
-      <w:r>
-        <w:rPr>
-          <w:lang w:val="de-DE"/>
-        </w:rPr>
-        <w:t>ị. Ma ha bồ đề </w:t>
-      </w:r>
-    </w:p>
-    <w:p>
-      <w:pPr>
-        <w:rPr>
-          <w:lang w:val="de-DE"/>
-        </w:rPr>
-      </w:pPr>
-      <w:r>
-        <w:rPr>
-          <w:lang w:val="de-DE"/>
-        </w:rPr>
-        <w:t xml:space="preserve">tát đỏa, tát bà tát bà, ma ra ma ra, ma hê ma </w:t>
-      </w:r>
-      <w:r>
-        <w:rPr>
-          <w:lang w:val="de-DE"/>
-        </w:rPr>
-        <w:t xml:space="preserve">hê rị </w:t>
-      </w:r>
-      <w:r>
-        <w:rPr>
-          <w:lang w:val="de-DE"/>
-        </w:rPr>
-        <w:t xml:space="preserve">đà dựng. Câu lô câu lô kiết mông. Độ lô độ lô phạt xà da đế, </w:t>
-      </w:r>
-    </w:p>
-    <w:p>
-      <w:pPr>
-        <w:rPr>
-          <w:lang w:val="de-DE"/>
-        </w:rPr>
-      </w:pPr>
-      <w:r>
-        <w:rPr>
-          <w:lang w:val="de-DE"/>
-        </w:rPr>
-        <w:t xml:space="preserve">ma ha phạt xa da đế. Đà ra đà ra địa ri ni, thất phật ra da. Giá ra giá ra. </w:t>
-      </w:r>
-    </w:p>
-    <w:p>
-      <w:pPr>
-        <w:rPr>
-          <w:lang w:val="de-DE"/>
-        </w:rPr>
-      </w:pPr>
-      <w:r>
-        <w:rPr>
-          <w:lang w:val="de-DE"/>
-        </w:rPr>
-        <w:t xml:space="preserve">Mạ mạ phạt ma ra, mục đế lệ. Y hê di hê, </w:t>
-      </w:r>
-    </w:p>
-    <w:p>
-      <w:pPr>
-        <w:rPr>
-          <w:lang w:val="de-DE"/>
-        </w:rPr>
-      </w:pPr>
-      <w:r>
-        <w:rPr>
-          <w:lang w:val="de-DE"/>
-        </w:rPr>
-        <w:t xml:space="preserve">thất na thất na, a ra sâm phật ra xá lợi, phạt sa phạt sâm. Phật ra xá da. Hô lô hô lô, ma ra hô lô hô lô hê rị. Ta ra ta ra, tất rị </w:t>
-      </w:r>
-    </w:p>
-    <w:p>
-      <w:pPr>
-        <w:rPr>
-          <w:lang w:val="de-DE"/>
-        </w:rPr>
-      </w:pPr>
-      <w:r>
-        <w:rPr>
-          <w:lang w:val="de-DE"/>
-        </w:rPr>
-        <w:t xml:space="preserve">tất rị, tô rô tô rô. Bồ đề dạ, bồ đề dạ, bồ đà dạ, bồ đà dạ. Di đế rị dạ. Na ra cẩn trì địa rị sắc </w:t>
+        <w:rPr>
+          <w:lang w:val="de-DE"/>
+        </w:rPr>
+      </w:pPr>
+      <w:r>
+        <w:rPr>
+          <w:lang w:val="de-DE"/>
+        </w:rPr>
+        <w:t xml:space="preserve"># </w:t>
+      </w:r>
+      <w:r>
+        <w:rPr>
+          <w:lang w:val="de-DE"/>
+        </w:rPr>
+        <w:t>KỆ KHAI KINH</w:t>
+      </w:r>
+      <w:r>
+        <w:rPr>
+          <w:lang w:val="de-DE"/>
+        </w:rPr>
+        <w:t xml:space="preserve"> 12:03</w:t>
+      </w:r>
+    </w:p>
+    <w:p>
+      <w:pPr>
+        <w:rPr>
+          <w:lang w:val="de-DE"/>
+        </w:rPr>
+      </w:pPr>
+      <w:bookmarkStart w:id="5" w:name="_Hlk215731201"/>
+      <w:r>
+        <w:rPr>
+          <w:lang w:val="de-DE"/>
+        </w:rPr>
+        <w:t xml:space="preserve">Phật pháp cao siêu rất nhiệm màu </w:t>
+      </w:r>
+    </w:p>
+    <w:bookmarkEnd w:id="5"/>
+    <w:p>
+      <w:pPr>
+        <w:rPr>
+          <w:lang w:val="de-DE"/>
+        </w:rPr>
+      </w:pPr>
+      <w:r>
+        <w:rPr>
+          <w:lang w:val="de-DE"/>
+        </w:rPr>
+        <w:t>Cơ duyên may được thọ trì</w:t>
       </w:r>
     </w:p>
     <w:p>
@@ -760,267 +1111,58 @@
           <w:lang w:val="de-DE"/>
         </w:rPr>
         <w:lastRenderedPageBreak/>
-        <w:t xml:space="preserve">ni na. Ba dạ ma na, ta bà ha Tất đà dạ ta bà ha Ma ha tất đà dạ ta bà ha Tất đà du nghệ thất bàn ra da ta bà ha </w:t>
-      </w:r>
-    </w:p>
-    <w:p>
-      <w:pPr>
-        <w:rPr>
-          <w:lang w:val="de-DE"/>
-        </w:rPr>
-      </w:pPr>
-      <w:r>
-        <w:rPr>
-          <w:lang w:val="de-DE"/>
-        </w:rPr>
-        <w:t xml:space="preserve">Na ra cẩn trì ta bà ha ta bà ha. Tất đà dạ ta bà ha, Ma ha tất đà dạ ta bà ha. Tất đà du nghệ thất bàn ra da, ta bà ha. </w:t>
-      </w:r>
-    </w:p>
-    <w:p>
-      <w:pPr>
-        <w:rPr>
-          <w:lang w:val="de-DE"/>
-        </w:rPr>
-      </w:pPr>
-      <w:r>
-        <w:rPr>
-          <w:lang w:val="de-DE"/>
-        </w:rPr>
-        <w:t>Na ra cẩn trì, ta bà ha. Ma ra na ra ta bà ha. Tất ra tăng a mục kh</w:t>
-      </w:r>
-      <w:r>
-        <w:rPr>
-          <w:lang w:val="de-DE"/>
-        </w:rPr>
-        <w:t>ế</w:t>
-      </w:r>
-      <w:r>
-        <w:rPr>
-          <w:lang w:val="de-DE"/>
-        </w:rPr>
-        <w:t xml:space="preserve"> da ta bà ha, ta bà ma ha a tất đà dạ ta bà ha. Giả kiết </w:t>
-      </w:r>
-    </w:p>
-    <w:p>
-      <w:pPr>
-        <w:rPr>
-          <w:lang w:val="de-DE"/>
-        </w:rPr>
-      </w:pPr>
-      <w:r>
-        <w:rPr>
-          <w:lang w:val="de-DE"/>
-        </w:rPr>
-        <w:t xml:space="preserve">ra a tất đà dạ ta bà ha. Ba đà ma yết tất đà dạ, ta bà ha. Na ra cẩn trì bàn đà ra dạ, </w:t>
-      </w:r>
-    </w:p>
-    <w:p>
-      <w:pPr>
-        <w:rPr>
-          <w:lang w:val="de-DE"/>
-        </w:rPr>
-      </w:pPr>
-      <w:r>
-        <w:rPr>
-          <w:lang w:val="de-DE"/>
-        </w:rPr>
-        <w:t xml:space="preserve">ta bà ha. </w:t>
-      </w:r>
-    </w:p>
-    <w:p>
-      <w:pPr>
-        <w:rPr>
-          <w:lang w:val="de-DE"/>
-        </w:rPr>
-      </w:pPr>
-      <w:r>
-        <w:rPr>
-          <w:lang w:val="de-DE"/>
-        </w:rPr>
-        <w:t>Ma bà l</w:t>
-      </w:r>
-      <w:r>
-        <w:rPr>
-          <w:lang w:val="de-DE"/>
-        </w:rPr>
-        <w:t>ợi</w:t>
-      </w:r>
-      <w:r>
-        <w:rPr>
-          <w:lang w:val="de-DE"/>
-        </w:rPr>
-        <w:t xml:space="preserve"> thắng kiết ra dạ, ta bà ha. Nam-Mô hắc ra đát na đa ra dạ da. Nam-Mô </w:t>
-      </w:r>
-      <w:r>
-        <w:rPr>
-          <w:lang w:val="de-DE"/>
-        </w:rPr>
-        <w:t xml:space="preserve">a rị </w:t>
-      </w:r>
-      <w:r>
-        <w:rPr>
-          <w:lang w:val="de-DE"/>
-        </w:rPr>
-        <w:t xml:space="preserve">da bà lô kiết đế, thước bàn ra dạ ta bà ha. </w:t>
-      </w:r>
-    </w:p>
-    <w:p>
-      <w:pPr>
-        <w:rPr>
-          <w:lang w:val="de-DE"/>
-        </w:rPr>
-      </w:pPr>
-      <w:r>
-        <w:rPr>
-          <w:lang w:val="de-DE"/>
-        </w:rPr>
-        <w:t xml:space="preserve">Án tất điện đô, mạn đa ra, bạt đà dạ, ta bà ha. ( 3 lần) </w:t>
-      </w:r>
-    </w:p>
-    <w:p>
-      <w:pPr>
-        <w:rPr>
-          <w:lang w:val="de-DE"/>
-        </w:rPr>
-      </w:pPr>
-      <w:r>
-        <w:rPr>
-          <w:lang w:val="de-DE"/>
-        </w:rPr>
-        <w:t xml:space="preserve">Nam mô Thập phương Thường trụ Tam bảo ( 3 lần) </w:t>
-      </w:r>
-    </w:p>
-    <w:p>
-      <w:pPr>
-        <w:rPr>
-          <w:lang w:val="de-DE"/>
-        </w:rPr>
-      </w:pPr>
-    </w:p>
-    <w:p>
-      <w:pPr>
-        <w:rPr>
-          <w:lang w:val="de-DE"/>
-        </w:rPr>
-      </w:pPr>
-      <w:r>
-        <w:rPr>
-          <w:lang w:val="de-DE"/>
-        </w:rPr>
-        <w:t>Trí tuệ bừng lên đóa biện tài,</w:t>
-      </w:r>
-    </w:p>
-    <w:p>
-      <w:pPr>
-        <w:rPr>
-          <w:lang w:val="de-DE"/>
-        </w:rPr>
-      </w:pPr>
-      <w:r>
-        <w:rPr>
-          <w:lang w:val="de-DE"/>
-        </w:rPr>
-        <w:t>Đứng yên trên sóng sạch trần ai,</w:t>
-      </w:r>
-    </w:p>
-    <w:p>
-      <w:pPr>
-        <w:rPr>
-          <w:lang w:val="de-DE"/>
-        </w:rPr>
-      </w:pPr>
-      <w:r>
-        <w:rPr>
-          <w:lang w:val="de-DE"/>
-        </w:rPr>
-        <w:t>Cam lộ chữa lành cơn khổ bệnh,</w:t>
-      </w:r>
-    </w:p>
-    <w:p>
-      <w:pPr>
-        <w:rPr>
-          <w:lang w:val="de-DE"/>
-        </w:rPr>
-      </w:pPr>
-      <w:r>
-        <w:rPr>
-          <w:lang w:val="de-DE"/>
-        </w:rPr>
-        <w:t>Hào quang quét sạch buổi nguy tai.</w:t>
-      </w:r>
-    </w:p>
-    <w:p>
-      <w:pPr>
-        <w:rPr>
-          <w:lang w:val="de-DE"/>
-        </w:rPr>
-      </w:pPr>
-      <w:r>
-        <w:rPr>
-          <w:lang w:val="de-DE"/>
-        </w:rPr>
-        <w:t>Liễu biếc phất bày muôn thế giới,</w:t>
-      </w:r>
-    </w:p>
-    <w:p>
-      <w:pPr>
-        <w:rPr>
-          <w:lang w:val="de-DE"/>
-        </w:rPr>
-      </w:pPr>
-      <w:r>
-        <w:rPr>
-          <w:lang w:val="de-DE"/>
-        </w:rPr>
-        <w:t>Sen hồng nở hé vạn lâu đài,</w:t>
-      </w:r>
-    </w:p>
-    <w:p>
-      <w:pPr>
-        <w:rPr>
-          <w:lang w:val="de-DE"/>
-        </w:rPr>
-      </w:pPr>
-      <w:r>
-        <w:rPr>
-          <w:lang w:val="de-DE"/>
-        </w:rPr>
-        <w:t>Cúi đầu ca ngợi dâng hương thỉnh,</w:t>
-      </w:r>
-    </w:p>
-    <w:p>
-      <w:pPr>
-        <w:rPr>
-          <w:lang w:val="de-DE"/>
-        </w:rPr>
-      </w:pPr>
-      <w:r>
-        <w:rPr>
-          <w:lang w:val="de-DE"/>
-        </w:rPr>
-        <w:t>Xin nguyện từ bi ứng hiện ngay.</w:t>
-      </w:r>
-    </w:p>
-    <w:p>
-      <w:pPr>
-        <w:rPr>
-          <w:lang w:val="de-DE"/>
-        </w:rPr>
-      </w:pPr>
-      <w:r>
-        <w:rPr>
-          <w:lang w:val="de-DE"/>
-        </w:rPr>
-        <w:t>Nam Mô Đại Bi Quán Thế Âm Bồ Tát.</w:t>
+        <w:t>Xin nguyện đi vào biển tuệ</w:t>
+      </w:r>
+    </w:p>
+    <w:p>
+      <w:pPr>
+        <w:rPr>
+          <w:lang w:val="de-DE"/>
+        </w:rPr>
+      </w:pPr>
+      <w:r>
+        <w:rPr>
+          <w:lang w:val="de-DE"/>
+        </w:rPr>
+        <w:t>Tinh thông giáo nghĩa huyền vi.</w:t>
+      </w:r>
+    </w:p>
+    <w:p>
+      <w:pPr>
+        <w:rPr>
+          <w:lang w:val="de-DE"/>
+        </w:rPr>
+      </w:pPr>
+      <w:r>
+        <w:rPr>
+          <w:lang w:val="de-DE"/>
+        </w:rPr>
+        <w:t xml:space="preserve">Nam mô </w:t>
+      </w:r>
+      <w:bookmarkStart w:id="6" w:name="_Hlk215731390"/>
+      <w:r>
+        <w:rPr>
+          <w:lang w:val="de-DE"/>
+        </w:rPr>
+        <w:t>Pháp Hoa Hội Thượng Phật</w:t>
+      </w:r>
+      <w:r>
+        <w:rPr>
+          <w:lang w:val="de-DE"/>
+        </w:rPr>
+        <w:t xml:space="preserve"> Bồ Tát </w:t>
+      </w:r>
+      <w:bookmarkEnd w:id="6"/>
+      <w:r>
+        <w:rPr>
+          <w:lang w:val="de-DE"/>
+        </w:rPr>
+        <w:t xml:space="preserve">( 3 lần) </w:t>
       </w:r>
     </w:p>
     <w:p>
       <w:pPr>
         <w:pStyle w:val="Heading1"/>
-        <w:numPr>
-          <w:ilvl w:val="0"/>
-          <w:numId w:val="11"/>
-        </w:numPr>
         <w:tabs>
           <w:tab w:val="left" w:pos="284"/>
         </w:tabs>
@@ -1032,125 +1174,20 @@
         <w:rPr>
           <w:lang w:val="de-DE"/>
         </w:rPr>
-        <w:t>KỆ KHAI KINH</w:t>
-      </w:r>
-    </w:p>
-    <w:p>
-      <w:pPr>
-        <w:rPr>
-          <w:lang w:val="de-DE"/>
-        </w:rPr>
-      </w:pPr>
-      <w:bookmarkStart w:id="4" w:name="_Hlk215731201"/>
-      <w:r>
-        <w:rPr>
-          <w:lang w:val="de-DE"/>
-        </w:rPr>
-        <w:t xml:space="preserve">Phật pháp cao siêu rất nhiệm màu </w:t>
-      </w:r>
-    </w:p>
-    <w:bookmarkEnd w:id="4"/>
-    <w:p>
-      <w:pPr>
-        <w:rPr>
-          <w:lang w:val="de-DE"/>
-        </w:rPr>
-      </w:pPr>
-      <w:r>
-        <w:rPr>
-          <w:lang w:val="de-DE"/>
-        </w:rPr>
-        <w:t>Cơ duyên may được thọ trì</w:t>
-      </w:r>
-    </w:p>
-    <w:p>
-      <w:pPr>
-        <w:rPr>
-          <w:lang w:val="de-DE"/>
-        </w:rPr>
-      </w:pPr>
-      <w:r>
-        <w:rPr>
-          <w:lang w:val="de-DE"/>
-        </w:rPr>
-        <w:lastRenderedPageBreak/>
-        <w:t>Xin nguyện đi vào biển tuệ</w:t>
-      </w:r>
-    </w:p>
-    <w:p>
-      <w:pPr>
-        <w:rPr>
-          <w:lang w:val="de-DE"/>
-        </w:rPr>
-      </w:pPr>
-      <w:r>
-        <w:rPr>
-          <w:lang w:val="de-DE"/>
-        </w:rPr>
-        <w:t>Tinh thông giáo nghĩa huyền vi.</w:t>
-      </w:r>
-    </w:p>
-    <w:p>
-      <w:pPr>
-        <w:rPr>
-          <w:lang w:val="de-DE"/>
-        </w:rPr>
-      </w:pPr>
-      <w:r>
-        <w:rPr>
-          <w:lang w:val="de-DE"/>
-        </w:rPr>
-        <w:t xml:space="preserve">Nam mô </w:t>
-      </w:r>
-      <w:bookmarkStart w:id="5" w:name="_Hlk215731390"/>
-      <w:r>
-        <w:rPr>
-          <w:lang w:val="de-DE"/>
-        </w:rPr>
-        <w:t>Pháp Hoa Hội Thượng Phật</w:t>
-      </w:r>
-      <w:r>
-        <w:rPr>
-          <w:lang w:val="de-DE"/>
-        </w:rPr>
-        <w:t xml:space="preserve"> Bồ Tát </w:t>
-      </w:r>
-      <w:bookmarkEnd w:id="5"/>
-      <w:r>
-        <w:rPr>
-          <w:lang w:val="de-DE"/>
-        </w:rPr>
-        <w:t xml:space="preserve">( 3 lần) </w:t>
-      </w:r>
-    </w:p>
-    <w:p>
-      <w:pPr>
-        <w:rPr>
-          <w:lang w:val="de-DE"/>
-        </w:rPr>
-      </w:pPr>
-    </w:p>
-    <w:p>
-      <w:pPr>
-        <w:pStyle w:val="Heading1"/>
-        <w:numPr>
-          <w:ilvl w:val="0"/>
-          <w:numId w:val="11"/>
-        </w:numPr>
-        <w:tabs>
-          <w:tab w:val="left" w:pos="284"/>
-        </w:tabs>
-        <w:ind w:left="360" w:firstLine="0"/>
-        <w:rPr>
-          <w:lang w:val="de-DE"/>
-        </w:rPr>
-      </w:pPr>
+        <w:t xml:space="preserve"># </w:t>
+      </w:r>
       <w:r>
         <w:rPr>
           <w:lang w:val="de-DE"/>
         </w:rPr>
         <w:t>KINH PHỔ MÔN</w:t>
       </w:r>
+      <w:r>
+        <w:rPr>
+          <w:lang w:val="de-DE"/>
+        </w:rPr>
+        <w:t xml:space="preserve"> 12:55</w:t>
+      </w:r>
     </w:p>
     <w:p>
       <w:pPr>
@@ -1187,7 +1224,20 @@
         <w:rPr>
           <w:lang w:val="de-DE"/>
         </w:rPr>
-        <w:t xml:space="preserve">Lúc bấy giờ, Ngài Vô Tận Ý Bồ-tát liền từ chỗ ngồi đứng dậy, trịch áo, bày vai hữu, chắp tay hướng Phật mà bạch rằng: “Thế Tôn! Ngài Quán </w:t>
+        <w:t xml:space="preserve">Lúc bấy giờ, Ngài Vô Tận Ý Bồ-tát liền từ chỗ ngồi đứng dậy, trịch áo, bày vai hữu, chắp tay hướng Phật </w:t>
+      </w:r>
+    </w:p>
+    <w:p>
+      <w:pPr>
+        <w:rPr>
+          <w:lang w:val="de-DE"/>
+        </w:rPr>
+      </w:pPr>
+      <w:r>
+        <w:rPr>
+          <w:lang w:val="de-DE"/>
+        </w:rPr>
+        <w:t xml:space="preserve">mà bạch rằng: “Thế Tôn! Ngài Quán </w:t>
       </w:r>
       <w:r>
         <w:rPr>
@@ -3536,14 +3586,14 @@
         </w:rPr>
         <w:t xml:space="preserve">Chí tâm đảnh lễ: Khi hành Bồ- tát, danh hiệu tôi Tự Tại Quán Âm, </w:t>
       </w:r>
-      <w:bookmarkStart w:id="6" w:name="_Hlk215732977"/>
+      <w:bookmarkStart w:id="7" w:name="_Hlk215732977"/>
       <w:r>
         <w:rPr>
           <w:lang w:val="de-DE"/>
         </w:rPr>
         <w:t xml:space="preserve">viên thông </w:t>
       </w:r>
-      <w:bookmarkEnd w:id="6"/>
+      <w:bookmarkEnd w:id="7"/>
       <w:r>
         <w:rPr>
           <w:lang w:val="de-DE"/>
@@ -3813,6 +3863,7 @@
         </w:rPr>
         <w:t>Tự quy y Phật, xin nguyện chúng sanh, thể theo đạo cả, phát tâm vô thượng. (1 lạy) Tự quy y Pháp, xin nguyện chúng sanh, thấu rõ kinh tạng, trí tuệ như biển. (1 lạy) Tự quy y Tăng, xin nguyện chúng sanh, thống lý đại chúng, hết thảy vô ngại. (1 lạy).  Cách tụng niệm và ý nghĩa của Kinh Phổ Môn</w:t>
       </w:r>
+      <w:bookmarkEnd w:id="0"/>
     </w:p>
     <w:sectPr>
       <w:pgSz w:w="12240" w:h="15840"/>
@@ -3998,6 +4049,95 @@
     </w:lvl>
   </w:abstractNum>
   <w:abstractNum w:abstractNumId="9" w15:restartNumberingAfterBreak="0">
+    <w:nsid w:val="4CC60317"/>
+    <w:multiLevelType w:val="hybridMultilevel"/>
+    <w:tmpl w:val="130E7DB4"/>
+    <w:lvl w:ilvl="0" w:tplc="0F6C1EE8">
+      <w:start w:val="1"/>
+      <w:numFmt w:val="decimal"/>
+      <w:lvlText w:val="(%1"/>
+      <w:lvlJc w:val="left"/>
+      <w:pPr>
+        <w:ind w:left="720" w:hanging="360"/>
+      </w:pPr>
+      <w:rPr>
+        <w:rFonts w:hint="default"/>
+      </w:rPr>
+    </w:lvl>
+    <w:lvl w:ilvl="1" w:tplc="04090019" w:tentative="1">
+      <w:start w:val="1"/>
+      <w:numFmt w:val="lowerLetter"/>
+      <w:lvlText w:val="%2."/>
+      <w:lvlJc w:val="left"/>
+      <w:pPr>
+        <w:ind w:left="1440" w:hanging="360"/>
+      </w:pPr>
+    </w:lvl>
+    <w:lvl w:ilvl="2" w:tplc="0409001B" w:tentative="1">
+      <w:start w:val="1"/>
+      <w:numFmt w:val="lowerRoman"/>
+      <w:lvlText w:val="%3."/>
+      <w:lvlJc w:val="right"/>
+      <w:pPr>
+        <w:ind w:left="2160" w:hanging="180"/>
+      </w:pPr>
+    </w:lvl>
+    <w:lvl w:ilvl="3" w:tplc="0409000F" w:tentative="1">
+      <w:start w:val="1"/>
+      <w:numFmt w:val="decimal"/>
+      <w:lvlText w:val="%4."/>
+      <w:lvlJc w:val="left"/>
+      <w:pPr>
+        <w:ind w:left="2880" w:hanging="360"/>
+      </w:pPr>
+    </w:lvl>
+    <w:lvl w:ilvl="4" w:tplc="04090019" w:tentative="1">
+      <w:start w:val="1"/>
+      <w:numFmt w:val="lowerLetter"/>
+      <w:lvlText w:val="%5."/>
+      <w:lvlJc w:val="left"/>
+      <w:pPr>
+        <w:ind w:left="3600" w:hanging="360"/>
+      </w:pPr>
+    </w:lvl>
+    <w:lvl w:ilvl="5" w:tplc="0409001B" w:tentative="1">
+      <w:start w:val="1"/>
+      <w:numFmt w:val="lowerRoman"/>
+      <w:lvlText w:val="%6."/>
+      <w:lvlJc w:val="right"/>
+      <w:pPr>
+        <w:ind w:left="4320" w:hanging="180"/>
+      </w:pPr>
+    </w:lvl>
+    <w:lvl w:ilvl="6" w:tplc="0409000F" w:tentative="1">
+      <w:start w:val="1"/>
+      <w:numFmt w:val="decimal"/>
+      <w:lvlText w:val="%7."/>
+      <w:lvlJc w:val="left"/>
+      <w:pPr>
+        <w:ind w:left="5040" w:hanging="360"/>
+      </w:pPr>
+    </w:lvl>
+    <w:lvl w:ilvl="7" w:tplc="04090019" w:tentative="1">
+      <w:start w:val="1"/>
+      <w:numFmt w:val="lowerLetter"/>
+      <w:lvlText w:val="%8."/>
+      <w:lvlJc w:val="left"/>
+      <w:pPr>
+        <w:ind w:left="5760" w:hanging="360"/>
+      </w:pPr>
+    </w:lvl>
+    <w:lvl w:ilvl="8" w:tplc="0409001B" w:tentative="1">
+      <w:start w:val="1"/>
+      <w:numFmt w:val="lowerRoman"/>
+      <w:lvlText w:val="%9."/>
+      <w:lvlJc w:val="right"/>
+      <w:pPr>
+        <w:ind w:left="6480" w:hanging="180"/>
+      </w:pPr>
+    </w:lvl>
+  </w:abstractNum>
+  <w:abstractNum w:abstractNumId="10" w15:restartNumberingAfterBreak="0">
     <w:nsid w:val="57D72653"/>
     <w:multiLevelType w:val="hybridMultilevel"/>
     <w:tmpl w:val="0F5C8A50"/>
@@ -4083,7 +4223,7 @@
       </w:pPr>
     </w:lvl>
   </w:abstractNum>
-  <w:abstractNum w:abstractNumId="10" w15:restartNumberingAfterBreak="0">
+  <w:abstractNum w:abstractNumId="11" w15:restartNumberingAfterBreak="0">
     <w:nsid w:val="5CB14E66"/>
     <w:multiLevelType w:val="hybridMultilevel"/>
     <w:tmpl w:val="0F5C8A50"/>
@@ -4197,10 +4337,13 @@
     <w:abstractNumId w:val="0"/>
   </w:num>
   <w:num w:numId="10" w16cid:durableId="1548033988">
-    <w:abstractNumId w:val="9"/>
+    <w:abstractNumId w:val="10"/>
   </w:num>
   <w:num w:numId="11" w16cid:durableId="1604268323">
-    <w:abstractNumId w:val="10"/>
+    <w:abstractNumId w:val="11"/>
+  </w:num>
+  <w:num w:numId="12" w16cid:durableId="543447149">
+    <w:abstractNumId w:val="9"/>
   </w:num>
 </w:numbering>
 </file>

</xml_diff>